<commit_message>
Calibri font via xelatex + symmetric image padding + casual team brief
PDF typography:
- Switched pandoc from pdflatex to xelatex
- Calibri embedded as mainfont via -V mainfont=Calibri
- Reports now use Calibri throughout (verified: VEQAUP+Calibri-Bold, YWXNOH+Calibri embedded in PDF)
- 15 pages (vs 16 previously), cleaner typography

Image symmetry:
- All matplotlib savefig calls now use pad_inches=0.3
- Custom diagrams (pipeline, LSTM arch, rolling, iteration) centered properly
- EDA, metrics_comparison, DM plot regenerated with explicit padding

Team brief:
- Teslim/Ekip_Brief.md: casual Turkish briefing for the group
- Plain language: what we did, where, what we found
- Includes anticipated Q&A from the professor

Teslim folder now contains 10 files including the brief.
</commit_message>
<xml_diff>
--- a/EBT629E_Final_Project_Report.docx
+++ b/EBT629E_Final_Project_Report.docx
@@ -466,7 +466,7 @@
       <w:r>
         <w:drawing>
           <wp:inline xmlns:a="http://schemas.openxmlformats.org/drawingml/2006/main" xmlns:pic="http://schemas.openxmlformats.org/drawingml/2006/picture">
-            <wp:extent cx="5760720" cy="3276841"/>
+            <wp:extent cx="5760720" cy="3346320"/>
             <wp:docPr id="2" name="Picture 2"/>
             <wp:cNvGraphicFramePr>
               <a:graphicFrameLocks noChangeAspect="1"/>
@@ -487,7 +487,7 @@
                   <pic:spPr>
                     <a:xfrm>
                       <a:off x="0" y="0"/>
-                      <a:ext cx="5760720" cy="3276841"/>
+                      <a:ext cx="5760720" cy="3346320"/>
                     </a:xfrm>
                     <a:prstGeom prst="rect"/>
                   </pic:spPr>
@@ -624,7 +624,7 @@
       <w:r>
         <w:drawing>
           <wp:inline xmlns:a="http://schemas.openxmlformats.org/drawingml/2006/main" xmlns:pic="http://schemas.openxmlformats.org/drawingml/2006/picture">
-            <wp:extent cx="5029200" cy="4016587"/>
+            <wp:extent cx="5029200" cy="4055911"/>
             <wp:docPr id="3" name="Picture 3"/>
             <wp:cNvGraphicFramePr>
               <a:graphicFrameLocks noChangeAspect="1"/>
@@ -645,7 +645,7 @@
                   <pic:spPr>
                     <a:xfrm>
                       <a:off x="0" y="0"/>
-                      <a:ext cx="5029200" cy="4016587"/>
+                      <a:ext cx="5029200" cy="4055911"/>
                     </a:xfrm>
                     <a:prstGeom prst="rect"/>
                   </pic:spPr>
@@ -722,7 +722,7 @@
       <w:r>
         <w:drawing>
           <wp:inline xmlns:a="http://schemas.openxmlformats.org/drawingml/2006/main" xmlns:pic="http://schemas.openxmlformats.org/drawingml/2006/picture">
-            <wp:extent cx="5760720" cy="3343477"/>
+            <wp:extent cx="5760720" cy="3422086"/>
             <wp:docPr id="4" name="Picture 4"/>
             <wp:cNvGraphicFramePr>
               <a:graphicFrameLocks noChangeAspect="1"/>
@@ -743,7 +743,7 @@
                   <pic:spPr>
                     <a:xfrm>
                       <a:off x="0" y="0"/>
-                      <a:ext cx="5760720" cy="3343477"/>
+                      <a:ext cx="5760720" cy="3422086"/>
                     </a:xfrm>
                     <a:prstGeom prst="rect"/>
                   </pic:spPr>
@@ -877,7 +877,7 @@
       <w:r>
         <w:drawing>
           <wp:inline xmlns:a="http://schemas.openxmlformats.org/drawingml/2006/main" xmlns:pic="http://schemas.openxmlformats.org/drawingml/2006/picture">
-            <wp:extent cx="5669280" cy="3504343"/>
+            <wp:extent cx="5669280" cy="3557514"/>
             <wp:docPr id="5" name="Picture 5"/>
             <wp:cNvGraphicFramePr>
               <a:graphicFrameLocks noChangeAspect="1"/>
@@ -898,7 +898,7 @@
                   <pic:spPr>
                     <a:xfrm>
                       <a:off x="0" y="0"/>
-                      <a:ext cx="5669280" cy="3504343"/>
+                      <a:ext cx="5669280" cy="3557514"/>
                     </a:xfrm>
                     <a:prstGeom prst="rect"/>
                   </pic:spPr>
@@ -1449,7 +1449,7 @@
       <w:r>
         <w:drawing>
           <wp:inline xmlns:a="http://schemas.openxmlformats.org/drawingml/2006/main" xmlns:pic="http://schemas.openxmlformats.org/drawingml/2006/picture">
-            <wp:extent cx="5760720" cy="1588868"/>
+            <wp:extent cx="5760720" cy="1680123"/>
             <wp:docPr id="6" name="Picture 6"/>
             <wp:cNvGraphicFramePr>
               <a:graphicFrameLocks noChangeAspect="1"/>
@@ -1470,7 +1470,7 @@
                   <pic:spPr>
                     <a:xfrm>
                       <a:off x="0" y="0"/>
-                      <a:ext cx="5760720" cy="1588868"/>
+                      <a:ext cx="5760720" cy="1680123"/>
                     </a:xfrm>
                     <a:prstGeom prst="rect"/>
                   </pic:spPr>
@@ -1749,7 +1749,7 @@
       <w:r>
         <w:drawing>
           <wp:inline xmlns:a="http://schemas.openxmlformats.org/drawingml/2006/main" xmlns:pic="http://schemas.openxmlformats.org/drawingml/2006/picture">
-            <wp:extent cx="5760720" cy="2900021"/>
+            <wp:extent cx="5760720" cy="2994434"/>
             <wp:docPr id="10" name="Picture 10"/>
             <wp:cNvGraphicFramePr>
               <a:graphicFrameLocks noChangeAspect="1"/>
@@ -1770,7 +1770,7 @@
                   <pic:spPr>
                     <a:xfrm>
                       <a:off x="0" y="0"/>
-                      <a:ext cx="5760720" cy="2900021"/>
+                      <a:ext cx="5760720" cy="2994434"/>
                     </a:xfrm>
                     <a:prstGeom prst="rect"/>
                   </pic:spPr>
@@ -2285,7 +2285,7 @@
       <w:r>
         <w:drawing>
           <wp:inline xmlns:a="http://schemas.openxmlformats.org/drawingml/2006/main" xmlns:pic="http://schemas.openxmlformats.org/drawingml/2006/picture">
-            <wp:extent cx="5486400" cy="2466024"/>
+            <wp:extent cx="5486400" cy="2573067"/>
             <wp:docPr id="11" name="Picture 11"/>
             <wp:cNvGraphicFramePr>
               <a:graphicFrameLocks noChangeAspect="1"/>
@@ -2306,7 +2306,7 @@
                   <pic:spPr>
                     <a:xfrm>
                       <a:off x="0" y="0"/>
-                      <a:ext cx="5486400" cy="2466024"/>
+                      <a:ext cx="5486400" cy="2573067"/>
                     </a:xfrm>
                     <a:prstGeom prst="rect"/>
                   </pic:spPr>

</xml_diff>